<commit_message>
Part 7: the across-sites figure redrawn so no line crosses a box or a word (site keys in a row under the root, one loop per site drawn once)
Co-Authored-By: Claude Fable 5.1 <noreply@anthropic.com>
Claude-Session: https://claude.ai/code/session_01DkQpVYNjMdJtfzj74tR8ZC
</commit_message>
<xml_diff>
--- a/blog/08-the-chip-that-says-no-7-scaling-no.docx
+++ b/blog/08-the-chip-that-says-no-7-scaling-no.docx
@@ -1176,7 +1176,7 @@
       <w:r>
         <w:drawing>
           <wp:inline distT="0" distB="0" distL="0" distR="0">
-            <wp:extent cx="5943600" cy="3324225"/>
+            <wp:extent cx="5943600" cy="3448050"/>
             <wp:effectExtent t="0" r="0" b="0" l="0"/>
             <wp:docPr id="32" name="" descr="" title=""/>
             <wp:cNvGraphicFramePr>
@@ -1201,7 +1201,7 @@
                   <pic:spPr bwMode="auto">
                     <a:xfrm>
                       <a:off x="0" y="0"/>
-                      <a:ext cx="5943600" cy="3324225"/>
+                      <a:ext cx="5943600" cy="3448050"/>
                     </a:xfrm>
                     <a:prstGeom prst="rect">
                       <a:avLst/>
@@ -1358,7 +1358,7 @@
       <w:r>
         <w:t xml:space="preserve">The design of the fabric, with every message type, the roster, the edition change, the heartbeat, the budgets, the logs and the partition table: docs/02-safety-fabric.md in the chip's repository, </w:t>
       </w:r>
-      <w:hyperlink w:history="1" r:id="rIddsgbc_fq_eokxngdc-gqa">
+      <w:hyperlink w:history="1" r:id="rIdpuhavh4zdhmrt0bmmuzvn">
         <w:r>
           <w:rPr>
             <w:rStyle w:val="Hyperlink"/>
@@ -1372,7 +1372,7 @@
       <w:r>
         <w:t xml:space="preserve"> Where the governor lives and the three tiers: </w:t>
       </w:r>
-      <w:hyperlink w:history="1" r:id="rIdqurenlbuyllhqp7cjxolp">
+      <w:hyperlink w:history="1" r:id="rId903kti05iq3b4c7cxd_vt">
         <w:r>
           <w:rPr>
             <w:rStyle w:val="Hyperlink"/>
@@ -1386,7 +1386,7 @@
       <w:r>
         <w:t xml:space="preserve"> Every plug, the NVSwitch and DPU management paths, and the asks to NVIDIA: </w:t>
       </w:r>
-      <w:hyperlink w:history="1" r:id="rIdgvpaslwu5svxf_f8djg5f">
+      <w:hyperlink w:history="1" r:id="rIdkmfyxxzvwwdre8454xa3o">
         <w:r>
           <w:rPr>
             <w:rStyle w:val="Hyperlink"/>
@@ -1400,7 +1400,7 @@
       <w:r>
         <w:t xml:space="preserve"> The ticket, the register map, the physical targets (area, power, package): </w:t>
       </w:r>
-      <w:hyperlink w:history="1" r:id="rId4fpg1esy4yvude9gzajdb">
+      <w:hyperlink w:history="1" r:id="rIdt6wifm5tg4qd0fxnxwtpc">
         <w:r>
           <w:rPr>
             <w:rStyle w:val="Hyperlink"/>
@@ -1427,7 +1427,7 @@
       <w:r>
         <w:t xml:space="preserve">The halt loop as a circuit, 72 governors, 39 configurations, worst case 317 microseconds: </w:t>
       </w:r>
-      <w:hyperlink w:history="1" r:id="rIda_mzmwlsl7fyskevuudrh">
+      <w:hyperlink w:history="1" r:id="rId4gs6j-i8seggodu3azpsk">
         <w:r>
           <w:rPr>
             <w:rStyle w:val="Hyperlink"/>
@@ -1438,7 +1438,7 @@
       <w:r>
         <w:t xml:space="preserve"> and the generated table </w:t>
       </w:r>
-      <w:hyperlink w:history="1" r:id="rIdeyjbz4q8fztgdu4awxzpl">
+      <w:hyperlink w:history="1" r:id="rId9ggulz1fg_nuyyfbxetsr">
         <w:r>
           <w:rPr>
             <w:rStyle w:val="Hyperlink"/>
@@ -1452,7 +1452,7 @@
       <w:r>
         <w:t xml:space="preserve"> The rack wiring, the two cluster wires and the power-on sequence: </w:t>
       </w:r>
-      <w:hyperlink w:history="1" r:id="rIdevpoxgvfwvtjwzj9k8rrm">
+      <w:hyperlink w:history="1" r:id="rIdyo2gndlwecryhesicfx88">
         <w:r>
           <w:rPr>
             <w:rStyle w:val="Hyperlink"/>
@@ -1476,7 +1476,7 @@
       <w:r>
         <w:t xml:space="preserve">The tests behind the four mechanisms: tests/test_h11_halt_loop.py, test_h12_fabric_auth.py, test_h13_shared_budget.py and test_h14_partition.py in </w:t>
       </w:r>
-      <w:hyperlink w:history="1" r:id="rIdcto9je-6jhxkn62knnsit">
+      <w:hyperlink w:history="1" r:id="rIdnnpdnrjqfwjg-2tcasnqm">
         <w:r>
           <w:rPr>
             <w:rStyle w:val="Hyperlink"/>
@@ -1503,7 +1503,7 @@
       <w:r>
         <w:t xml:space="preserve">Why the gate belongs at the ends and not in the network, with the theorem and the check: </w:t>
       </w:r>
-      <w:hyperlink w:history="1" r:id="rId_0ncgzrgxdzxd3t-ubnwd">
+      <w:hyperlink w:history="1" r:id="rId016me5qvtgnv6-pj2a_bc">
         <w:r>
           <w:rPr>
             <w:rStyle w:val="Hyperlink"/>
@@ -1514,7 +1514,7 @@
       <w:r>
         <w:t xml:space="preserve"> and Part 6 of this series. The open questions, including 1 (coverage), 7 (a shared rack), 14 (people), 16 (a multilateral root) and now 17 (sites): </w:t>
       </w:r>
-      <w:hyperlink w:history="1" r:id="rId3vhkeybhevsvnmrsfritt">
+      <w:hyperlink w:history="1" r:id="rIdbawk-ku309mq_f2o6uqw0">
         <w:r>
           <w:rPr>
             <w:rStyle w:val="Hyperlink"/>
@@ -1528,7 +1528,7 @@
       <w:r>
         <w:t xml:space="preserve"> The ladder, and why the person is the top rung: </w:t>
       </w:r>
-      <w:hyperlink w:history="1" r:id="rId3dbpd_vk1-iesxy_xfhsg">
+      <w:hyperlink w:history="1" r:id="rId6ya2hzznuplwftzhkogjx">
         <w:r>
           <w:rPr>
             <w:rStyle w:val="Hyperlink"/>
@@ -1552,7 +1552,7 @@
       <w:r>
         <w:t xml:space="preserve">The retrofit question, per lever, is experiment P2 in </w:t>
       </w:r>
-      <w:hyperlink w:history="1" r:id="rId-nmycpkfl6hmksnn_q1nq">
+      <w:hyperlink w:history="1" r:id="rIdd4izvtaojlalrzioq4p-n">
         <w:r>
           <w:rPr>
             <w:rStyle w:val="Hyperlink"/>
@@ -1566,7 +1566,7 @@
       <w:r>
         <w:t xml:space="preserve"> The road from here to a chip we cannot fab, with the bench loop and the FPGA: </w:t>
       </w:r>
-      <w:hyperlink w:history="1" r:id="rIdliaav8jp2cei2nuufa2bw">
+      <w:hyperlink w:history="1" r:id="rIdd333jacq3lwxqnlal4faq">
         <w:r>
           <w:rPr>
             <w:rStyle w:val="Hyperlink"/>
@@ -1603,7 +1603,7 @@
       <w:r>
         <w:t xml:space="preserve">The drawings are made by </w:t>
       </w:r>
-      <w:hyperlink w:history="1" r:id="rId7umbwtm9j2sqdbxicxyx1">
+      <w:hyperlink w:history="1" r:id="rIdkcquethdqrg0naak2nrnf">
         <w:r>
           <w:rPr>
             <w:rStyle w:val="Hyperlink"/>

</xml_diff>

<commit_message>
Part 7: the rack figure redrawn as two clean panels, one wire each (the loop threads the governors like beads and turns outside the trays; the fabric as two rings)
Co-Authored-By: Claude Fable 5.1 <noreply@anthropic.com>
Claude-Session: https://claude.ai/code/session_01DkQpVYNjMdJtfzj74tR8ZC
</commit_message>
<xml_diff>
--- a/blog/08-the-chip-that-says-no-7-scaling-no.docx
+++ b/blog/08-the-chip-that-says-no-7-scaling-no.docx
@@ -594,7 +594,7 @@
       <w:r>
         <w:drawing>
           <wp:inline distT="0" distB="0" distL="0" distR="0">
-            <wp:extent cx="5943600" cy="3448050"/>
+            <wp:extent cx="5943600" cy="3686175"/>
             <wp:effectExtent t="0" r="0" b="0" l="0"/>
             <wp:docPr id="27" name="" descr="" title=""/>
             <wp:cNvGraphicFramePr>
@@ -619,7 +619,7 @@
                   <pic:spPr bwMode="auto">
                     <a:xfrm>
                       <a:off x="0" y="0"/>
-                      <a:ext cx="5943600" cy="3448050"/>
+                      <a:ext cx="5943600" cy="3686175"/>
                     </a:xfrm>
                     <a:prstGeom prst="rect">
                       <a:avLst/>
@@ -1358,7 +1358,7 @@
       <w:r>
         <w:t xml:space="preserve">The design of the fabric, with every message type, the roster, the edition change, the heartbeat, the budgets, the logs and the partition table: docs/02-safety-fabric.md in the chip's repository, </w:t>
       </w:r>
-      <w:hyperlink w:history="1" r:id="rIdpuhavh4zdhmrt0bmmuzvn">
+      <w:hyperlink w:history="1" r:id="rIdiugin3jayd47mlweownnw">
         <w:r>
           <w:rPr>
             <w:rStyle w:val="Hyperlink"/>
@@ -1372,7 +1372,7 @@
       <w:r>
         <w:t xml:space="preserve"> Where the governor lives and the three tiers: </w:t>
       </w:r>
-      <w:hyperlink w:history="1" r:id="rId903kti05iq3b4c7cxd_vt">
+      <w:hyperlink w:history="1" r:id="rId_t3uu2-_7pwcwfdooaajj">
         <w:r>
           <w:rPr>
             <w:rStyle w:val="Hyperlink"/>
@@ -1386,7 +1386,7 @@
       <w:r>
         <w:t xml:space="preserve"> Every plug, the NVSwitch and DPU management paths, and the asks to NVIDIA: </w:t>
       </w:r>
-      <w:hyperlink w:history="1" r:id="rIdkmfyxxzvwwdre8454xa3o">
+      <w:hyperlink w:history="1" r:id="rIdlq284q6r0b4qwbtniquah">
         <w:r>
           <w:rPr>
             <w:rStyle w:val="Hyperlink"/>
@@ -1400,7 +1400,7 @@
       <w:r>
         <w:t xml:space="preserve"> The ticket, the register map, the physical targets (area, power, package): </w:t>
       </w:r>
-      <w:hyperlink w:history="1" r:id="rIdt6wifm5tg4qd0fxnxwtpc">
+      <w:hyperlink w:history="1" r:id="rIdjynfbxjalemdj0zzylssr">
         <w:r>
           <w:rPr>
             <w:rStyle w:val="Hyperlink"/>
@@ -1427,7 +1427,7 @@
       <w:r>
         <w:t xml:space="preserve">The halt loop as a circuit, 72 governors, 39 configurations, worst case 317 microseconds: </w:t>
       </w:r>
-      <w:hyperlink w:history="1" r:id="rId4gs6j-i8seggodu3azpsk">
+      <w:hyperlink w:history="1" r:id="rIdik9f32qopbuavid-u-fpa">
         <w:r>
           <w:rPr>
             <w:rStyle w:val="Hyperlink"/>
@@ -1438,7 +1438,7 @@
       <w:r>
         <w:t xml:space="preserve"> and the generated table </w:t>
       </w:r>
-      <w:hyperlink w:history="1" r:id="rId9ggulz1fg_nuyyfbxetsr">
+      <w:hyperlink w:history="1" r:id="rIdyieq91iq-d1t5-nkicb0s">
         <w:r>
           <w:rPr>
             <w:rStyle w:val="Hyperlink"/>
@@ -1452,7 +1452,7 @@
       <w:r>
         <w:t xml:space="preserve"> The rack wiring, the two cluster wires and the power-on sequence: </w:t>
       </w:r>
-      <w:hyperlink w:history="1" r:id="rIdyo2gndlwecryhesicfx88">
+      <w:hyperlink w:history="1" r:id="rIdaqdy_ftaoop0vecfffp3k">
         <w:r>
           <w:rPr>
             <w:rStyle w:val="Hyperlink"/>
@@ -1476,7 +1476,7 @@
       <w:r>
         <w:t xml:space="preserve">The tests behind the four mechanisms: tests/test_h11_halt_loop.py, test_h12_fabric_auth.py, test_h13_shared_budget.py and test_h14_partition.py in </w:t>
       </w:r>
-      <w:hyperlink w:history="1" r:id="rIdnnpdnrjqfwjg-2tcasnqm">
+      <w:hyperlink w:history="1" r:id="rIdkps5hdb4spsiue_7yo8gs">
         <w:r>
           <w:rPr>
             <w:rStyle w:val="Hyperlink"/>
@@ -1503,7 +1503,7 @@
       <w:r>
         <w:t xml:space="preserve">Why the gate belongs at the ends and not in the network, with the theorem and the check: </w:t>
       </w:r>
-      <w:hyperlink w:history="1" r:id="rId016me5qvtgnv6-pj2a_bc">
+      <w:hyperlink w:history="1" r:id="rIdhdlejyjalwve03aftocya">
         <w:r>
           <w:rPr>
             <w:rStyle w:val="Hyperlink"/>
@@ -1514,7 +1514,7 @@
       <w:r>
         <w:t xml:space="preserve"> and Part 6 of this series. The open questions, including 1 (coverage), 7 (a shared rack), 14 (people), 16 (a multilateral root) and now 17 (sites): </w:t>
       </w:r>
-      <w:hyperlink w:history="1" r:id="rIdbawk-ku309mq_f2o6uqw0">
+      <w:hyperlink w:history="1" r:id="rIdxetdrmrkb7hrg6b2qm3_o">
         <w:r>
           <w:rPr>
             <w:rStyle w:val="Hyperlink"/>
@@ -1528,7 +1528,7 @@
       <w:r>
         <w:t xml:space="preserve"> The ladder, and why the person is the top rung: </w:t>
       </w:r>
-      <w:hyperlink w:history="1" r:id="rId6ya2hzznuplwftzhkogjx">
+      <w:hyperlink w:history="1" r:id="rIdc_hafyjqisrosnpp-45pv">
         <w:r>
           <w:rPr>
             <w:rStyle w:val="Hyperlink"/>
@@ -1552,7 +1552,7 @@
       <w:r>
         <w:t xml:space="preserve">The retrofit question, per lever, is experiment P2 in </w:t>
       </w:r>
-      <w:hyperlink w:history="1" r:id="rIdd4izvtaojlalrzioq4p-n">
+      <w:hyperlink w:history="1" r:id="rIdmntcmya1l7hbeiop6adil">
         <w:r>
           <w:rPr>
             <w:rStyle w:val="Hyperlink"/>
@@ -1566,7 +1566,7 @@
       <w:r>
         <w:t xml:space="preserve"> The road from here to a chip we cannot fab, with the bench loop and the FPGA: </w:t>
       </w:r>
-      <w:hyperlink w:history="1" r:id="rIdd333jacq3lwxqnlal4faq">
+      <w:hyperlink w:history="1" r:id="rIdo-7t2pqathbdgc3c8iltn">
         <w:r>
           <w:rPr>
             <w:rStyle w:val="Hyperlink"/>
@@ -1603,7 +1603,7 @@
       <w:r>
         <w:t xml:space="preserve">The drawings are made by </w:t>
       </w:r>
-      <w:hyperlink w:history="1" r:id="rIdkcquethdqrg0naak2nrnf">
+      <w:hyperlink w:history="1" r:id="rIdj67q_sw4ucxelml-rv6yo">
         <w:r>
           <w:rPr>
             <w:rStyle w:val="Hyperlink"/>

</xml_diff>